<commit_message>
paper: PDF and DOCX re-rendered from a fresh clone of dd87878
Co-Authored-By: Claude Opus 5.5 <noreply@anthropic.com>
Claude-Session: https://claude.ai/code/session_01PQMcQRzgxdHW39HLcF14eq
</commit_message>
<xml_diff>
--- a/paper/manuscript.docx
+++ b/paper/manuscript.docx
@@ -3149,7 +3149,7 @@
         <w:rPr>
           <w:rStyle w:val="VerbatimChar"/>
         </w:rPr>
-        <w:t xml:space="preserve">minimum-risk temp: 25.5 (95% CI 25.2 to 25.8), percentile 94.2</w:t>
+        <w:t xml:space="preserve">minimum-risk temp: 25.5 (95% CI 25.2 to 25.8), percentile 94.2 (2000 draws, seed 0)</w:t>
       </w:r>
       <w:r>
         <w:br/>
@@ -6634,7 +6634,7 @@
         <w:t xml:space="preserve"> </w:t>
       </w:r>
       <w:r>
-        <w:t xml:space="preserve">and knot helpers. The test suite (168 tests) compares against them. Tolerances are</w:t>
+        <w:t xml:space="preserve">and knot helpers. The test suite (170 tests) compares against them. Tolerances are</w:t>
       </w:r>
       <w:r>
         <w:t xml:space="preserve"> </w:t>
@@ -6774,7 +6774,34 @@
         <w:t xml:space="preserve">dlnm()</w:t>
       </w:r>
       <w:r>
-        <w:t xml:space="preserve">, the bootstrap functions and plotting have no R fixture of their own.</w:t>
+        <w:t xml:space="preserve">, the simulation helpers in</w:t>
+      </w:r>
+      <w:r>
+        <w:t xml:space="preserve"> </w:t>
+      </w:r>
+      <w:r>
+        <w:rPr>
+          <w:rStyle w:val="VerbatimChar"/>
+        </w:rPr>
+        <w:t xml:space="preserve">dlnmpy.uncertainty</w:t>
+      </w:r>
+      <w:r>
+        <w:t xml:space="preserve"> </w:t>
+      </w:r>
+      <w:r>
+        <w:t xml:space="preserve">(named</w:t>
+      </w:r>
+      <w:r>
+        <w:t xml:space="preserve"> </w:t>
+      </w:r>
+      <w:r>
+        <w:rPr>
+          <w:rStyle w:val="VerbatimChar"/>
+        </w:rPr>
+        <w:t xml:space="preserve">bootstrap</w:t>
+      </w:r>
+      <w:r>
+        <w:t xml:space="preserve">, though they simulate the coefficients and do not resample the data) and plotting have no R fixture of their own.</w:t>
       </w:r>
     </w:p>
     <w:bookmarkEnd w:id="43"/>
@@ -10950,7 +10977,7 @@
         <w:t xml:space="preserve"> </w:t>
       </w:r>
       <w:r>
-        <w:t xml:space="preserve">lists every defect with the release that fixed it, the function, whether it was silent, how it was found and the regression test that guards it. A defect is counted there if it gave a wrong number, crashed, hung, or rejected input that R accepts. By that rule there were 41 between releases 0.4.1 and 0.8.4. Of these, 28 gave wrong results without an error and 13 crashed or refused valid input. By location, 16 were in functions ported from R and 25 in the Python layers around them. The audits against R found 28, the reproductions of published analyses 11, a user’s run 1, and the source of 1 is not recorded. None was found by the unit fixtures, which is what they are for: they confirm that each piece is right once written, and the defects lay in how pieces were combined or in inputs the fixtures did not cover. The ledger names the 2 defects that have no targeted regression test. A statistical review of the package for this paper found 7 more, all silent and all in edge cases that no published analysis reached. They are fixed, with regression tests, for the next release and listed in the same ledger.</w:t>
+        <w:t xml:space="preserve">lists every defect with the release that fixed it, the function, whether it was silent, how it was found and the regression test that guards it. A defect is counted there if it gave a wrong number, crashed, hung, or rejected input that R accepts. By that rule there were 41 between releases 0.4.1 and 0.8.4. Of these, 28 gave wrong results without an error and 13 crashed or refused valid input. By location, 16 were in functions ported from R and 25 in the Python layers around them. The audits against R found 28, the reproductions of published analyses 11, a user’s run 1, and the source of 1 is not recorded. None was found by the unit fixtures, which is what they are for: they confirm that each piece is right once written, and the defects lay in how pieces were combined or in inputs the fixtures did not cover. The ledger names the 2 defects that have no targeted regression test. A statistical review of the package for this paper found 8 more, all silent and all in edge cases that no published analysis reached. They are fixed, with regression tests, for the next release and listed in the same ledger.</w:t>
       </w:r>
     </w:p>
     <w:bookmarkEnd w:id="59"/>
@@ -14939,7 +14966,7 @@
         <w:t xml:space="preserve">(Gasparrini et al. 2015)</w:t>
       </w:r>
       <w:r>
-        <w:t xml:space="preserve">. BLUP-based location estimates treat the between-location covariance as known. Penalised fits report the Bayesian covariance conditional on the smoothing parameters, without mgcv’s correction for their uncertainty</w:t>
+        <w:t xml:space="preserve">. BLUP-based location estimates treat the between-location covariance as known, and their covariance is the formula of mixmeta, which dlnmpy reproduces and does not refine. Penalised fits report the Bayesian covariance conditional on the smoothing parameters, without mgcv’s correction for their uncertainty</w:t>
       </w:r>
       <w:r>
         <w:t xml:space="preserve"> </w:t>

</xml_diff>

<commit_message>
paper: PDF and DOCX re-rendered from a fresh clone of 7a009d6 (author list)
Co-Authored-By: Claude Opus 5.5 <noreply@anthropic.com>
Claude-Session: https://claude.ai/code/session_01PQMcQRzgxdHW39HLcF14eq
</commit_message>
<xml_diff>
--- a/paper/manuscript.docx
+++ b/paper/manuscript.docx
@@ -20,6 +20,62 @@
     </w:p>
     <w:p>
       <w:pPr>
+        <w:pStyle w:val="Author"/>
+      </w:pPr>
+      <w:r>
+        <w:t xml:space="preserve">Gia [CHECK: surname, affiliation, ORCID]</w:t>
+      </w:r>
+    </w:p>
+    <w:p>
+      <w:pPr>
+        <w:pStyle w:val="Author"/>
+      </w:pPr>
+      <w:r>
+        <w:t xml:space="preserve">Ben [CHECK: surname, affiliation, ORCID]</w:t>
+      </w:r>
+    </w:p>
+    <w:p>
+      <w:pPr>
+        <w:pStyle w:val="Author"/>
+      </w:pPr>
+      <w:r>
+        <w:t xml:space="preserve">Sam [CHECK: surname, affiliation, ORCID]</w:t>
+      </w:r>
+    </w:p>
+    <w:p>
+      <w:pPr>
+        <w:pStyle w:val="Author"/>
+      </w:pPr>
+      <w:r>
+        <w:t xml:space="preserve">Sibusiso Makhanya [CHECK: affiliation, ORCID]</w:t>
+      </w:r>
+    </w:p>
+    <w:p>
+      <w:pPr>
+        <w:pStyle w:val="Author"/>
+      </w:pPr>
+      <w:r>
+        <w:t xml:space="preserve">Nicholas Brink [CHECK: joins only if he approves the manuscript; affiliation, ORCID]</w:t>
+      </w:r>
+    </w:p>
+    <w:p>
+      <w:pPr>
+        <w:pStyle w:val="Author"/>
+      </w:pPr>
+      <w:r>
+        <w:t xml:space="preserve">Admire [CHECK: surname, affiliation, ORCID]</w:t>
+      </w:r>
+    </w:p>
+    <w:p>
+      <w:pPr>
+        <w:pStyle w:val="Author"/>
+      </w:pPr>
+      <w:r>
+        <w:t xml:space="preserve">Matthew [CHECK: surname, affiliation, ORCID]</w:t>
+      </w:r>
+    </w:p>
+    <w:p>
+      <w:pPr>
         <w:pStyle w:val="AbstractTitle"/>
       </w:pPr>
       <w:r>
@@ -31,7 +87,7 @@
         <w:pStyle w:val="Abstract"/>
       </w:pPr>
       <w:r>
-        <w:t xml:space="preserve">Distributed lag non-linear models (DLNMs) are the standard framework for exposure-lag-response associations in environmental epidemiology, especially temperature and mortality. The reference implementation is the R package dlnm, with further R packages and scripts for the quantities applied papers report. This paper presents dlnmpy, a Python implementation of the framework and its workflow with no R dependency. It ports dlnm, with R’s spline, pretty() and quantile() routines so that default knots match, and adds attributable risk, the minimum mortality temperature, penalised DLNMs and a one-call workflow. Meta-analysis is in the companion package mixmetapy. Agreement with R is checked in three layers: fixtures generated in R, five analyses run in both languages (98 comparisons, each within 1e-10 + 1e-8|r| of R’s value r), and six published analyses whose authors’ R code was translated into Python and rerun. For England and Wales, the code of Gasparrini et al. (2015) gives a median minimum mortality percentile of 89.5 and an attributable fraction of 8.94%, and that of Gasparrini and Armstrong (2013) gives pooled relative risks of 1.101 at 22 °C and 1.309 at 0 °C. dlnmpy gives the same values, and the six translations agree with the authors’ code in all 161,356 comparisons at stated tolerances. These cover daily time series and one cohort, with log links, unit weights and, for penalised models, mgcv’s smoothing parameters. Development found 41 defects between releases 0.4.1 and 0.8.4, 28 of them silent, each recorded in a ledger. The executable manuscript reruns the examples and all six translations.</w:t>
+        <w:t xml:space="preserve">Distributed lag non-linear models (DLNMs) are the standard framework for exposure-lag-response associations in environmental epidemiology, especially temperature and mortality. The reference implementation is the R package dlnm, with further R packages and scripts for the quantities applied papers report. This paper presents dlnmpy, a Python implementation of the framework and its workflow with no R dependency. It ports dlnm, with R’s spline, pretty() and quantile() routines so that default knots match, and adds attributable risk, the minimum mortality temperature, penalised DLNMs and a one-call workflow. Meta-analysis is in the companion package mixmetapy. Agreement with R is checked in three layers: fixtures generated in R, five analyses run in both languages (98 comparisons, each within 1e-10 + 1e-8|r| of R’s value r), and six published analyses whose authors’ R code was translated into Python and rerun. For England and Wales, the code of Gasparrini et al. (2015) gives a median minimum mortality percentile of 89.5 and an attributable fraction of 8.94%, and that of Gasparrini and Armstrong (2013) gives pooled relative risks of 1.101 at 22 °C and 1.309 at 0 °C. dlnmpy gives the same values, and the six translations agree with that code in all 161,356 comparisons at stated tolerances. These cover daily time series and one cohort, with log links, unit weights and, for penalised models, mgcv’s smoothing parameters. Development found 41 defects between releases 0.4.1 and 0.8.4, 28 of them silent, each recorded in a ledger. The executable manuscript reruns the examples and all six translations.</w:t>
       </w:r>
     </w:p>
     <w:bookmarkStart w:id="20" w:name="introduction"/>
@@ -14895,7 +14951,7 @@
         </w:r>
       </w:hyperlink>
       <w:r>
-        <w:t xml:space="preserve">, the one-call Chicago fit with its summary took 1 seconds and the attributable-risk table with 5,000 simulations 6 seconds. The translation of</w:t>
+        <w:t xml:space="preserve">, the one-call Chicago fit with its summary took 1 seconds and the attributable-risk table with 5,000 simulations 5 seconds. The translation of</w:t>
       </w:r>
       <w:r>
         <w:t xml:space="preserve"> </w:t>
@@ -16855,7 +16911,7 @@
         <w:t xml:space="preserve"> </w:t>
       </w:r>
       <w:r>
-        <w:t xml:space="preserve">CP: conceptualisation, methodology, software, validation, formal analysis, investigation, data curation, writing (original draft, review and editing), visualisation, project administration.</w:t>
+        <w:t xml:space="preserve">CP: conceptualisation, methodology, software, validation, formal analysis, investigation, data curation, writing (original draft, review and editing), visualisation, project administration. [CHECK: CRediT roles of each co-author, and a description of any independent checks they made of the software or the manuscript.]</w:t>
       </w:r>
     </w:p>
     <w:p>
@@ -16873,7 +16929,7 @@
         <w:t xml:space="preserve"> </w:t>
       </w:r>
       <w:r>
-        <w:t xml:space="preserve">dlnmpy, mixmetapy and this manuscript were developed with substantial assistance from an AI coding assistant (Claude, Anthropic), over about seven weeks from late August 2026. The assistant drafted the Python code, the tests, the R scripts that produce the reference results, the translations of the published analyses, the audits, the documentation and the manuscript. The author designed the project, decided what to port and how it would be checked against R, directed the work, ran the comparisons and reviewed each defect fix and its test before release. Commits the assistant contributed to are marked as co-authored in the repository history. The checks described in Section 5 were produced by the same process, apart from the authors’ published R scripts they run, and the author takes responsibility for all of the work.</w:t>
+        <w:t xml:space="preserve">dlnmpy, mixmetapy and this manuscript were developed with substantial assistance from an AI coding assistant (Claude, Anthropic), over about seven weeks from late August 2026. The assistant drafted the Python code, the tests, the R scripts that produce the reference results, the translations of the published analyses, the audits, the documentation and the manuscript. Craig Parker designed the project, decided what to port and how it would be checked against R, directed the work, ran the comparisons and reviewed each defect fix and its test before release. Commits the assistant contributed to are marked as co-authored in the repository history. The checks described in Section 5 were produced by the same process, apart from the original authors’ published R scripts they run. Craig Parker takes responsibility for the software and the analyses, and all authors for the manuscript.</w:t>
       </w:r>
     </w:p>
     <w:p>
@@ -16963,7 +17019,7 @@
         <w:t xml:space="preserve">findmin</w:t>
       </w:r>
       <w:r>
-        <w:t xml:space="preserve">), Francesco Sera (mixmeta), Ana Vicedo-Cabrera, Simon Wood (mgcv) and the R Core Team (splines and base). None of them has reviewed dlnmpy, and any errors are the author’s.</w:t>
+        <w:t xml:space="preserve">), Francesco Sera (mixmeta), Ana Vicedo-Cabrera, Simon Wood (mgcv) and the R Core Team (splines and base). None of them has reviewed dlnmpy, and any errors are ours.</w:t>
       </w:r>
     </w:p>
     <w:bookmarkEnd w:id="73"/>

</xml_diff>

<commit_message>
paper: PDF and DOCX re-rendered from a fresh clone of 337be87 (full author list)
Co-Authored-By: Claude Opus 5.5 <noreply@anthropic.com>
Claude-Session: https://claude.ai/code/session_01PQMcQRzgxdHW39HLcF14eq
</commit_message>
<xml_diff>
--- a/paper/manuscript.docx
+++ b/paper/manuscript.docx
@@ -23,7 +23,7 @@
         <w:pStyle w:val="Author"/>
       </w:pPr>
       <w:r>
-        <w:t xml:space="preserve">Gia [CHECK: surname, affiliation, ORCID]</w:t>
+        <w:t xml:space="preserve">Geir [CHECK: surname and ORCID]</w:t>
       </w:r>
     </w:p>
     <w:p>
@@ -31,7 +31,7 @@
         <w:pStyle w:val="Author"/>
       </w:pPr>
       <w:r>
-        <w:t xml:space="preserve">Ben [CHECK: surname, affiliation, ORCID]</w:t>
+        <w:t xml:space="preserve">Benjamin de Vantier du Plessis [CHECK: spelling of surname, ORCID]</w:t>
       </w:r>
     </w:p>
     <w:p>
@@ -39,7 +39,7 @@
         <w:pStyle w:val="Author"/>
       </w:pPr>
       <w:r>
-        <w:t xml:space="preserve">Sam [CHECK: surname, affiliation, ORCID]</w:t>
+        <w:t xml:space="preserve">Sam Zermatten-Jack [CHECK: spelling of surname, ORCID]</w:t>
       </w:r>
     </w:p>
     <w:p>
@@ -47,7 +47,7 @@
         <w:pStyle w:val="Author"/>
       </w:pPr>
       <w:r>
-        <w:t xml:space="preserve">Sibusiso Makhanya [CHECK: affiliation, ORCID]</w:t>
+        <w:t xml:space="preserve">Sibusisiwe Audrey Makhanya [CHECK: you said Sibusiso; ORCID]</w:t>
       </w:r>
     </w:p>
     <w:p>
@@ -55,7 +55,7 @@
         <w:pStyle w:val="Author"/>
       </w:pPr>
       <w:r>
-        <w:t xml:space="preserve">Nicholas Brink [CHECK: joins only if he approves the manuscript; affiliation, ORCID]</w:t>
+        <w:t xml:space="preserve">Nicholas Brian Brink [CHECK: joins only if he approves the manuscript; ORCID]</w:t>
       </w:r>
     </w:p>
     <w:p>
@@ -63,7 +63,7 @@
         <w:pStyle w:val="Author"/>
       </w:pPr>
       <w:r>
-        <w:t xml:space="preserve">Admire [CHECK: surname, affiliation, ORCID]</w:t>
+        <w:t xml:space="preserve">Admire Chikandiwa [CHECK: ORCID]</w:t>
       </w:r>
     </w:p>
     <w:p>
@@ -71,7 +71,7 @@
         <w:pStyle w:val="Author"/>
       </w:pPr>
       <w:r>
-        <w:t xml:space="preserve">Matthew [CHECK: surname, affiliation, ORCID]</w:t>
+        <w:t xml:space="preserve">Matthew Chersich [CHECK: ORCID]</w:t>
       </w:r>
     </w:p>
     <w:p>
@@ -16653,7 +16653,7 @@
         <w:t xml:space="preserve"> </w:t>
       </w:r>
       <w:r>
-        <w:t xml:space="preserve">for Python. The six translations and the side-by-side comparison took 8 minutes of the render between them, of which the translation of</w:t>
+        <w:t xml:space="preserve">for Python. The six translations and the side-by-side comparison took 7 minutes of the render between them, of which the translation of</w:t>
       </w:r>
       <w:r>
         <w:t xml:space="preserve"> </w:t>

</xml_diff>